<commit_message>
crear inventario en python
</commit_message>
<xml_diff>
--- a/documentos/practica_28_septiembre.docx
+++ b/documentos/practica_28_septiembre.docx
@@ -2,7 +2,966 @@
 <file path=word/document.xml><?xml version="1.0" encoding="utf-8"?>
 <w:document xmlns:wpc="http://schemas.microsoft.com/office/word/2010/wordprocessingCanvas" xmlns:cx="http://schemas.microsoft.com/office/drawing/2014/chartex" xmlns:cx1="http://schemas.microsoft.com/office/drawing/2015/9/8/chartex" xmlns:cx2="http://schemas.microsoft.com/office/drawing/2015/10/21/chartex" xmlns:cx3="http://schemas.microsoft.com/office/drawing/2016/5/9/chartex" xmlns:cx4="http://schemas.microsoft.com/office/drawing/2016/5/10/chartex" xmlns:cx5="http://schemas.microsoft.com/office/drawing/2016/5/11/chartex" xmlns:cx6="http://schemas.microsoft.com/office/drawing/2016/5/12/chartex" xmlns:cx7="http://schemas.microsoft.com/office/drawing/2016/5/13/chartex" xmlns:cx8="http://schemas.microsoft.com/office/drawing/2016/5/14/chartex" xmlns:mc="http://schemas.openxmlformats.org/markup-compatibility/2006" xmlns:aink="http://schemas.microsoft.com/office/drawing/2016/ink" xmlns:am3d="http://schemas.microsoft.com/office/drawing/2017/model3d" xmlns:o="urn:schemas-microsoft-com:office:office" xmlns:oel="http://schemas.microsoft.com/office/2019/extlst" xmlns:r="http://schemas.openxmlformats.org/officeDocument/2006/relationships" xmlns:m="http://schemas.openxmlformats.org/officeDocument/2006/math" xmlns:v="urn:schemas-microsoft-com:vml" xmlns:wp14="http://schemas.microsoft.com/office/word/2010/wordprocessingDrawing" xmlns:wp="http://schemas.openxmlformats.org/drawingml/2006/wordprocessingDrawing" xmlns:w10="urn:schemas-microsoft-com:office:word" xmlns:w="http://schemas.openxmlformats.org/wordprocessingml/2006/main" xmlns:w14="http://schemas.microsoft.com/office/word/2010/wordml" xmlns:w15="http://schemas.microsoft.com/office/word/2012/wordml" xmlns:w16cex="http://schemas.microsoft.com/office/word/2018/wordml/cex" xmlns:w16cid="http://schemas.microsoft.com/office/word/2016/wordml/cid" xmlns:w16="http://schemas.microsoft.com/office/word/2018/wordml" xmlns:w16sdtdh="http://schemas.microsoft.com/office/word/2020/wordml/sdtdatahash" xmlns:w16se="http://schemas.microsoft.com/office/word/2015/wordml/symex" xmlns:wpg="http://schemas.microsoft.com/office/word/2010/wordprocessingGroup" xmlns:wpi="http://schemas.microsoft.com/office/word/2010/wordprocessingInk" xmlns:wne="http://schemas.microsoft.com/office/word/2006/wordml" xmlns:wps="http://schemas.microsoft.com/office/word/2010/wordprocessingShape" mc:Ignorable="w14 w15 w16se w16cid w16 w16cex w16sdtdh wp14">
   <w:body>
+    <w:p>
+      <w:pPr>
+        <w:pStyle w:val="Prrafodelista"/>
+        <w:numPr>
+          <w:ilvl w:val="0"/>
+          <w:numId w:val="1"/>
+        </w:numPr>
+      </w:pPr>
+      <w:r>
+        <w:t>Identificación de Pares: Enumera tres claves (</w:t>
+      </w:r>
+      <w:proofErr w:type="spellStart"/>
+      <w:r>
+        <w:t>keys</w:t>
+      </w:r>
+      <w:proofErr w:type="spellEnd"/>
+      <w:r>
+        <w:t>) presentes en el nivel superior del objeto JSON.</w:t>
+      </w:r>
+    </w:p>
+    <w:p>
+      <w:pPr>
+        <w:ind w:left="360"/>
+      </w:pPr>
+      <w:r>
+        <w:t>“</w:t>
+      </w:r>
+      <w:proofErr w:type="spellStart"/>
+      <w:r>
+        <w:t>hostname</w:t>
+      </w:r>
+      <w:proofErr w:type="spellEnd"/>
+      <w:r>
+        <w:t>” es cadena</w:t>
+      </w:r>
+    </w:p>
+    <w:p>
+      <w:pPr>
+        <w:ind w:left="360"/>
+        <w:rPr>
+          <w:lang w:val="en-US"/>
+        </w:rPr>
+      </w:pPr>
+      <w:r>
+        <w:rPr>
+          <w:lang w:val="en-US"/>
+        </w:rPr>
+        <w:t>“</w:t>
+      </w:r>
+      <w:proofErr w:type="spellStart"/>
+      <w:proofErr w:type="gramStart"/>
+      <w:r>
+        <w:rPr>
+          <w:lang w:val="en-US"/>
+        </w:rPr>
+        <w:t>managed</w:t>
+      </w:r>
+      <w:proofErr w:type="gramEnd"/>
+      <w:r>
+        <w:rPr>
+          <w:lang w:val="en-US"/>
+        </w:rPr>
+        <w:t>_by_apic</w:t>
+      </w:r>
+      <w:proofErr w:type="spellEnd"/>
+      <w:r>
+        <w:rPr>
+          <w:lang w:val="en-US"/>
+        </w:rPr>
+        <w:t>”</w:t>
+      </w:r>
+      <w:r>
+        <w:rPr>
+          <w:lang w:val="en-US"/>
+        </w:rPr>
+        <w:t xml:space="preserve"> es </w:t>
+      </w:r>
+      <w:proofErr w:type="spellStart"/>
+      <w:r>
+        <w:rPr>
+          <w:lang w:val="en-US"/>
+        </w:rPr>
+        <w:t>booleano</w:t>
+      </w:r>
+      <w:proofErr w:type="spellEnd"/>
+    </w:p>
+    <w:p>
+      <w:pPr>
+        <w:ind w:left="360"/>
+        <w:rPr>
+          <w:lang w:val="en-US"/>
+        </w:rPr>
+      </w:pPr>
+      <w:r>
+        <w:rPr>
+          <w:lang w:val="en-US"/>
+        </w:rPr>
+        <w:t>“</w:t>
+      </w:r>
+      <w:proofErr w:type="spellStart"/>
+      <w:proofErr w:type="gramStart"/>
+      <w:r>
+        <w:rPr>
+          <w:lang w:val="en-US"/>
+        </w:rPr>
+        <w:t>uptime</w:t>
+      </w:r>
+      <w:proofErr w:type="gramEnd"/>
+      <w:r>
+        <w:rPr>
+          <w:lang w:val="en-US"/>
+        </w:rPr>
+        <w:t>_days”</w:t>
+      </w:r>
+      <w:r>
+        <w:rPr>
+          <w:lang w:val="en-US"/>
+        </w:rPr>
+        <w:t>es</w:t>
+      </w:r>
+      <w:proofErr w:type="spellEnd"/>
+      <w:r>
+        <w:rPr>
+          <w:lang w:val="en-US"/>
+        </w:rPr>
+        <w:t xml:space="preserve"> </w:t>
+      </w:r>
+      <w:proofErr w:type="spellStart"/>
+      <w:r>
+        <w:rPr>
+          <w:lang w:val="en-US"/>
+        </w:rPr>
+        <w:t>entero</w:t>
+      </w:r>
+      <w:proofErr w:type="spellEnd"/>
+    </w:p>
+    <w:p>
+      <w:pPr>
+        <w:pStyle w:val="Prrafodelista"/>
+        <w:numPr>
+          <w:ilvl w:val="0"/>
+          <w:numId w:val="1"/>
+        </w:numPr>
+      </w:pPr>
+      <w:r>
+        <w:t xml:space="preserve">Tipos de Datos: Identifica un ejemplo de cada uno de los siguientes tipos en el código: </w:t>
+      </w:r>
+      <w:proofErr w:type="spellStart"/>
+      <w:r>
+        <w:t>String</w:t>
+      </w:r>
+      <w:proofErr w:type="spellEnd"/>
+      <w:r>
+        <w:t xml:space="preserve">, </w:t>
+      </w:r>
+      <w:proofErr w:type="spellStart"/>
+      <w:r>
+        <w:t>Number</w:t>
+      </w:r>
+      <w:proofErr w:type="spellEnd"/>
+      <w:r>
+        <w:t xml:space="preserve">, </w:t>
+      </w:r>
+      <w:proofErr w:type="spellStart"/>
+      <w:r>
+        <w:t>Boolean</w:t>
+      </w:r>
+      <w:proofErr w:type="spellEnd"/>
+      <w:r>
+        <w:t xml:space="preserve"> y </w:t>
+      </w:r>
+      <w:proofErr w:type="spellStart"/>
+      <w:r>
+        <w:t>Null</w:t>
+      </w:r>
+      <w:proofErr w:type="spellEnd"/>
+      <w:r>
+        <w:t>.</w:t>
+      </w:r>
+    </w:p>
+    <w:p>
+      <w:proofErr w:type="spellStart"/>
+      <w:proofErr w:type="gramStart"/>
+      <w:r>
+        <w:t>String</w:t>
+      </w:r>
+      <w:proofErr w:type="spellEnd"/>
+      <w:r>
+        <w:t xml:space="preserve"> :</w:t>
+      </w:r>
+      <w:proofErr w:type="gramEnd"/>
+      <w:r>
+        <w:t xml:space="preserve"> “</w:t>
+      </w:r>
+      <w:proofErr w:type="spellStart"/>
+      <w:r>
+        <w:t>name</w:t>
+      </w:r>
+      <w:proofErr w:type="spellEnd"/>
+      <w:r>
+        <w:t>”</w:t>
+      </w:r>
+    </w:p>
+    <w:p>
+      <w:proofErr w:type="spellStart"/>
+      <w:proofErr w:type="gramStart"/>
+      <w:r>
+        <w:t>Number</w:t>
+      </w:r>
+      <w:proofErr w:type="spellEnd"/>
+      <w:r>
+        <w:t xml:space="preserve"> :</w:t>
+      </w:r>
+      <w:proofErr w:type="gramEnd"/>
+      <w:r>
+        <w:t xml:space="preserve"> </w:t>
+      </w:r>
+      <w:proofErr w:type="spellStart"/>
+      <w:r>
+        <w:t>mtu</w:t>
+      </w:r>
+      <w:proofErr w:type="spellEnd"/>
+    </w:p>
+    <w:p>
+      <w:proofErr w:type="spellStart"/>
+      <w:proofErr w:type="gramStart"/>
+      <w:r>
+        <w:t>Boolean</w:t>
+      </w:r>
+      <w:proofErr w:type="spellEnd"/>
+      <w:r>
+        <w:t xml:space="preserve"> :</w:t>
+      </w:r>
+      <w:proofErr w:type="gramEnd"/>
+      <w:r>
+        <w:t xml:space="preserve"> </w:t>
+      </w:r>
+      <w:proofErr w:type="spellStart"/>
+      <w:r>
+        <w:t>enabled</w:t>
+      </w:r>
+      <w:proofErr w:type="spellEnd"/>
+    </w:p>
+    <w:p>
+      <w:proofErr w:type="spellStart"/>
+      <w:proofErr w:type="gramStart"/>
+      <w:r>
+        <w:t>Null</w:t>
+      </w:r>
+      <w:proofErr w:type="spellEnd"/>
+      <w:r>
+        <w:t xml:space="preserve"> :</w:t>
+      </w:r>
+      <w:proofErr w:type="gramEnd"/>
+      <w:r>
+        <w:t xml:space="preserve"> </w:t>
+      </w:r>
+      <w:proofErr w:type="spellStart"/>
+      <w:r>
+        <w:t>description</w:t>
+      </w:r>
+      <w:proofErr w:type="spellEnd"/>
+    </w:p>
+    <w:p>
+      <w:pPr>
+        <w:pStyle w:val="Prrafodelista"/>
+        <w:numPr>
+          <w:ilvl w:val="0"/>
+          <w:numId w:val="1"/>
+        </w:numPr>
+      </w:pPr>
+      <w:r>
+        <w:t>. ¿Qué errores de sintaxis impiden que este JSON sea válido según los estándares de red y programación? Selecciona las dos opciones correctas.</w:t>
+      </w:r>
+    </w:p>
+    <w:p>
+      <w:pPr>
+        <w:pStyle w:val="Prrafodelista"/>
+      </w:pPr>
+      <w:r>
+        <w:t xml:space="preserve"> A) El valor de '</w:t>
+      </w:r>
+      <w:proofErr w:type="spellStart"/>
+      <w:r>
+        <w:t>vlan_id</w:t>
+      </w:r>
+      <w:proofErr w:type="spellEnd"/>
+      <w:r>
+        <w:t xml:space="preserve">' debería estar entre comillas dobles obligatoriamente. </w:t>
+      </w:r>
+    </w:p>
+    <w:p>
+      <w:pPr>
+        <w:pStyle w:val="Prrafodelista"/>
+      </w:pPr>
+      <w:r>
+        <w:t>B) Las claves como '</w:t>
+      </w:r>
+      <w:proofErr w:type="spellStart"/>
+      <w:r>
+        <w:t>vlan_id</w:t>
+      </w:r>
+      <w:proofErr w:type="spellEnd"/>
+      <w:r>
+        <w:t xml:space="preserve">' no deben llevar guiones bajos. </w:t>
+      </w:r>
+    </w:p>
+    <w:p>
+      <w:pPr>
+        <w:pStyle w:val="Prrafodelista"/>
+      </w:pPr>
+      <w:r>
+        <w:rPr>
+          <w:highlight w:val="yellow"/>
+        </w:rPr>
+        <w:t>C) Existe una coma final (</w:t>
+      </w:r>
+      <w:proofErr w:type="spellStart"/>
+      <w:r>
+        <w:rPr>
+          <w:highlight w:val="yellow"/>
+        </w:rPr>
+        <w:t>trailing</w:t>
+      </w:r>
+      <w:proofErr w:type="spellEnd"/>
+      <w:r>
+        <w:rPr>
+          <w:highlight w:val="yellow"/>
+        </w:rPr>
+        <w:t xml:space="preserve"> </w:t>
+      </w:r>
+      <w:proofErr w:type="spellStart"/>
+      <w:r>
+        <w:rPr>
+          <w:highlight w:val="yellow"/>
+        </w:rPr>
+        <w:t>comma</w:t>
+      </w:r>
+      <w:proofErr w:type="spellEnd"/>
+      <w:r>
+        <w:rPr>
+          <w:highlight w:val="yellow"/>
+        </w:rPr>
+        <w:t>) después del valor de '</w:t>
+      </w:r>
+      <w:proofErr w:type="spellStart"/>
+      <w:r>
+        <w:rPr>
+          <w:highlight w:val="yellow"/>
+        </w:rPr>
+        <w:t>description</w:t>
+      </w:r>
+      <w:proofErr w:type="spellEnd"/>
+      <w:r>
+        <w:rPr>
+          <w:highlight w:val="yellow"/>
+        </w:rPr>
+        <w:t>'.</w:t>
+      </w:r>
+    </w:p>
+    <w:p>
+      <w:pPr>
+        <w:pStyle w:val="Prrafodelista"/>
+      </w:pPr>
+      <w:r>
+        <w:rPr>
+          <w:highlight w:val="yellow"/>
+        </w:rPr>
+        <w:t>D) Faltan comas para separar los pares clave-valor después de '</w:t>
+      </w:r>
+      <w:proofErr w:type="spellStart"/>
+      <w:r>
+        <w:rPr>
+          <w:highlight w:val="yellow"/>
+        </w:rPr>
+        <w:t>vlan_id</w:t>
+      </w:r>
+      <w:proofErr w:type="spellEnd"/>
+      <w:r>
+        <w:rPr>
+          <w:highlight w:val="yellow"/>
+        </w:rPr>
+        <w:t>' y '</w:t>
+      </w:r>
+      <w:proofErr w:type="spellStart"/>
+      <w:r>
+        <w:rPr>
+          <w:highlight w:val="yellow"/>
+        </w:rPr>
+        <w:t>name</w:t>
+      </w:r>
+      <w:proofErr w:type="spellEnd"/>
+      <w:r>
+        <w:rPr>
+          <w:highlight w:val="yellow"/>
+        </w:rPr>
+        <w:t>'</w:t>
+      </w:r>
+    </w:p>
+    <w:p>
+      <w:r>
+        <w:t>4. Reflexión Técnica: Explica por qué es crítico que un controlador como Cisco DNA Center reciba un JSON perfectamente validado antes de aplicar cambios en la red.</w:t>
+      </w:r>
+    </w:p>
+    <w:p>
+      <w:r>
+        <w:t>R=Es critico por que si uno de los elementos falla toda la red también lo hará o por lo menos una parte de ella</w:t>
+      </w:r>
+    </w:p>
+    <w:p>
+      <w:r>
+        <w:t>Parte 1</w:t>
+      </w:r>
+    </w:p>
+    <w:p>
+      <w:pPr>
+        <w:pStyle w:val="Prrafodelista"/>
+        <w:numPr>
+          <w:ilvl w:val="0"/>
+          <w:numId w:val="2"/>
+        </w:numPr>
+      </w:pPr>
+      <w:r>
+        <w:t xml:space="preserve">Escribe el pseudocódigo o completa el script de Python necesario para procesar la variable </w:t>
+      </w:r>
+      <w:proofErr w:type="spellStart"/>
+      <w:r>
+        <w:t>inventario_json</w:t>
+      </w:r>
+      <w:proofErr w:type="spellEnd"/>
+      <w:r>
+        <w:t xml:space="preserve"> (que contiene el texto anterior). El script debe filtrar e imprimir únicamente los </w:t>
+      </w:r>
+      <w:proofErr w:type="spellStart"/>
+      <w:r>
+        <w:t>hostnames</w:t>
+      </w:r>
+      <w:proofErr w:type="spellEnd"/>
+      <w:r>
+        <w:t xml:space="preserve"> de los dispositivos cuyo estado sea '</w:t>
+      </w:r>
+      <w:proofErr w:type="spellStart"/>
+      <w:r>
+        <w:t>down</w:t>
+      </w:r>
+      <w:proofErr w:type="spellEnd"/>
+      <w:proofErr w:type="gramStart"/>
+      <w:r>
+        <w:t>' .</w:t>
+      </w:r>
+      <w:proofErr w:type="gramEnd"/>
+    </w:p>
+    <w:p>
+      <w:pPr>
+        <w:rPr>
+          <w:lang w:val="en-US"/>
+        </w:rPr>
+      </w:pPr>
+      <w:proofErr w:type="spellStart"/>
+      <w:r>
+        <w:rPr>
+          <w:lang w:val="en-US"/>
+        </w:rPr>
+        <w:t>inventario</w:t>
+      </w:r>
+      <w:proofErr w:type="spellEnd"/>
+      <w:r>
+        <w:rPr>
+          <w:lang w:val="en-US"/>
+        </w:rPr>
+        <w:t>= [</w:t>
+      </w:r>
+    </w:p>
+    <w:p>
+      <w:pPr>
+        <w:rPr>
+          <w:lang w:val="en-US"/>
+        </w:rPr>
+      </w:pPr>
+      <w:r>
+        <w:rPr>
+          <w:lang w:val="en-US"/>
+        </w:rPr>
+        <w:tab/>
+        <w:t>{"hostname": "Core-SW01", "</w:t>
+      </w:r>
+      <w:proofErr w:type="spellStart"/>
+      <w:r>
+        <w:rPr>
+          <w:lang w:val="en-US"/>
+        </w:rPr>
+        <w:t>ip</w:t>
+      </w:r>
+      <w:proofErr w:type="spellEnd"/>
+      <w:r>
+        <w:rPr>
+          <w:lang w:val="en-US"/>
+        </w:rPr>
+        <w:t>": "10.0.0.1", "status": "up"},</w:t>
+      </w:r>
+    </w:p>
+    <w:p>
+      <w:pPr>
+        <w:rPr>
+          <w:lang w:val="en-US"/>
+        </w:rPr>
+      </w:pPr>
+      <w:r>
+        <w:rPr>
+          <w:lang w:val="en-US"/>
+        </w:rPr>
+        <w:tab/>
+        <w:t>{"hostname": "Dist-SW02", "</w:t>
+      </w:r>
+      <w:proofErr w:type="spellStart"/>
+      <w:r>
+        <w:rPr>
+          <w:lang w:val="en-US"/>
+        </w:rPr>
+        <w:t>ip</w:t>
+      </w:r>
+      <w:proofErr w:type="spellEnd"/>
+      <w:r>
+        <w:rPr>
+          <w:lang w:val="en-US"/>
+        </w:rPr>
+        <w:t>": "10.0.0.2", "status": "down"},</w:t>
+      </w:r>
+    </w:p>
+    <w:p>
+      <w:pPr>
+        <w:rPr>
+          <w:lang w:val="en-US"/>
+        </w:rPr>
+      </w:pPr>
+      <w:r>
+        <w:rPr>
+          <w:lang w:val="en-US"/>
+        </w:rPr>
+        <w:tab/>
+        <w:t>{"hostname": "Access-SW03", "</w:t>
+      </w:r>
+      <w:proofErr w:type="spellStart"/>
+      <w:r>
+        <w:rPr>
+          <w:lang w:val="en-US"/>
+        </w:rPr>
+        <w:t>ip</w:t>
+      </w:r>
+      <w:proofErr w:type="spellEnd"/>
+      <w:r>
+        <w:rPr>
+          <w:lang w:val="en-US"/>
+        </w:rPr>
+        <w:t>": "10.0.0.3", "status": "up"},</w:t>
+      </w:r>
+    </w:p>
+    <w:p>
+      <w:pPr>
+        <w:rPr>
+          <w:lang w:val="en-US"/>
+        </w:rPr>
+      </w:pPr>
+      <w:r>
+        <w:rPr>
+          <w:lang w:val="en-US"/>
+        </w:rPr>
+        <w:tab/>
+        <w:t>{"hostname": "Edge-R01", "</w:t>
+      </w:r>
+      <w:proofErr w:type="spellStart"/>
+      <w:r>
+        <w:rPr>
+          <w:lang w:val="en-US"/>
+        </w:rPr>
+        <w:t>ip</w:t>
+      </w:r>
+      <w:proofErr w:type="spellEnd"/>
+      <w:r>
+        <w:rPr>
+          <w:lang w:val="en-US"/>
+        </w:rPr>
+        <w:t>": "172.16.1.1", "status": "down"}</w:t>
+      </w:r>
+    </w:p>
+    <w:p>
+      <w:r>
+        <w:t>]</w:t>
+      </w:r>
+    </w:p>
     <w:p/>
+    <w:p>
+      <w:r>
+        <w:t xml:space="preserve">#imprimir todos los </w:t>
+      </w:r>
+      <w:proofErr w:type="spellStart"/>
+      <w:r>
+        <w:t>hostnames</w:t>
+      </w:r>
+      <w:proofErr w:type="spellEnd"/>
+    </w:p>
+    <w:p>
+      <w:proofErr w:type="spellStart"/>
+      <w:r>
+        <w:lastRenderedPageBreak/>
+        <w:t>for</w:t>
+      </w:r>
+      <w:proofErr w:type="spellEnd"/>
+      <w:r>
+        <w:t xml:space="preserve"> h in inventario:</w:t>
+      </w:r>
+    </w:p>
+    <w:p>
+      <w:r>
+        <w:tab/>
+      </w:r>
+      <w:proofErr w:type="spellStart"/>
+      <w:r>
+        <w:t>print</w:t>
+      </w:r>
+      <w:proofErr w:type="spellEnd"/>
+      <w:r>
+        <w:t>(h["</w:t>
+      </w:r>
+      <w:proofErr w:type="spellStart"/>
+      <w:r>
+        <w:t>hostname</w:t>
+      </w:r>
+      <w:proofErr w:type="spellEnd"/>
+      <w:r>
+        <w:t>"])</w:t>
+      </w:r>
+    </w:p>
+    <w:p>
+      <w:r>
+        <w:t>#imprimir todas las IPS</w:t>
+      </w:r>
+    </w:p>
+    <w:p>
+      <w:pPr>
+        <w:rPr>
+          <w:lang w:val="en-US"/>
+        </w:rPr>
+      </w:pPr>
+      <w:r>
+        <w:rPr>
+          <w:lang w:val="en-US"/>
+        </w:rPr>
+        <w:t xml:space="preserve">for </w:t>
+      </w:r>
+      <w:proofErr w:type="spellStart"/>
+      <w:r>
+        <w:rPr>
+          <w:lang w:val="en-US"/>
+        </w:rPr>
+        <w:t>i</w:t>
+      </w:r>
+      <w:proofErr w:type="spellEnd"/>
+      <w:r>
+        <w:rPr>
+          <w:lang w:val="en-US"/>
+        </w:rPr>
+        <w:t xml:space="preserve"> in </w:t>
+      </w:r>
+      <w:proofErr w:type="spellStart"/>
+      <w:r>
+        <w:rPr>
+          <w:lang w:val="en-US"/>
+        </w:rPr>
+        <w:t>inventario</w:t>
+      </w:r>
+      <w:proofErr w:type="spellEnd"/>
+      <w:r>
+        <w:rPr>
+          <w:lang w:val="en-US"/>
+        </w:rPr>
+        <w:t>:</w:t>
+      </w:r>
+    </w:p>
+    <w:p>
+      <w:pPr>
+        <w:rPr>
+          <w:lang w:val="en-US"/>
+        </w:rPr>
+      </w:pPr>
+      <w:r>
+        <w:rPr>
+          <w:lang w:val="en-US"/>
+        </w:rPr>
+        <w:tab/>
+        <w:t>print(</w:t>
+      </w:r>
+      <w:proofErr w:type="spellStart"/>
+      <w:r>
+        <w:rPr>
+          <w:lang w:val="en-US"/>
+        </w:rPr>
+        <w:t>i</w:t>
+      </w:r>
+      <w:proofErr w:type="spellEnd"/>
+      <w:r>
+        <w:rPr>
+          <w:lang w:val="en-US"/>
+        </w:rPr>
+        <w:t>["</w:t>
+      </w:r>
+      <w:proofErr w:type="spellStart"/>
+      <w:r>
+        <w:rPr>
+          <w:lang w:val="en-US"/>
+        </w:rPr>
+        <w:t>ip</w:t>
+      </w:r>
+      <w:proofErr w:type="spellEnd"/>
+      <w:r>
+        <w:rPr>
+          <w:lang w:val="en-US"/>
+        </w:rPr>
+        <w:t>"])</w:t>
+      </w:r>
+    </w:p>
+    <w:p>
+      <w:r>
+        <w:t xml:space="preserve">#imprimir todos los que </w:t>
+      </w:r>
+      <w:proofErr w:type="spellStart"/>
+      <w:r>
+        <w:t>esten</w:t>
+      </w:r>
+      <w:proofErr w:type="spellEnd"/>
+      <w:r>
+        <w:t xml:space="preserve"> en </w:t>
+      </w:r>
+      <w:proofErr w:type="spellStart"/>
+      <w:r>
+        <w:t>down</w:t>
+      </w:r>
+      <w:proofErr w:type="spellEnd"/>
+    </w:p>
+    <w:p>
+      <w:pPr>
+        <w:rPr>
+          <w:lang w:val="en-US"/>
+        </w:rPr>
+      </w:pPr>
+      <w:r>
+        <w:rPr>
+          <w:lang w:val="en-US"/>
+        </w:rPr>
+        <w:t xml:space="preserve">for e in </w:t>
+      </w:r>
+      <w:proofErr w:type="spellStart"/>
+      <w:r>
+        <w:rPr>
+          <w:lang w:val="en-US"/>
+        </w:rPr>
+        <w:t>inventario</w:t>
+      </w:r>
+      <w:proofErr w:type="spellEnd"/>
+      <w:r>
+        <w:rPr>
+          <w:lang w:val="en-US"/>
+        </w:rPr>
+        <w:t>:</w:t>
+      </w:r>
+    </w:p>
+    <w:p>
+      <w:pPr>
+        <w:rPr>
+          <w:lang w:val="en-US"/>
+        </w:rPr>
+      </w:pPr>
+      <w:r>
+        <w:rPr>
+          <w:lang w:val="en-US"/>
+        </w:rPr>
+        <w:t xml:space="preserve">    if e["status"] == "down":</w:t>
+      </w:r>
+    </w:p>
+    <w:p>
+      <w:r>
+        <w:rPr>
+          <w:lang w:val="en-US"/>
+        </w:rPr>
+        <w:t xml:space="preserve">        </w:t>
+      </w:r>
+      <w:proofErr w:type="spellStart"/>
+      <w:r>
+        <w:t>print</w:t>
+      </w:r>
+      <w:proofErr w:type="spellEnd"/>
+      <w:r>
+        <w:t>(e)</w:t>
+      </w:r>
+    </w:p>
+    <w:p/>
+    <w:p>
+      <w:r>
+        <w:t xml:space="preserve">Parte 2: Comparativa de Formatos (JSON vs. XML) En redes modernas, REST </w:t>
+      </w:r>
+      <w:proofErr w:type="spellStart"/>
+      <w:r>
+        <w:t>APIs</w:t>
+      </w:r>
+      <w:proofErr w:type="spellEnd"/>
+      <w:r>
+        <w:t xml:space="preserve"> suelen preferir JSON por ser más ligero, pero muchos sistemas heredados o protocolos como NETCONF utilizan XML. Observa cómo se estructuran los mismos datos en </w:t>
+      </w:r>
+      <w:proofErr w:type="gramStart"/>
+      <w:r>
+        <w:t>ambos formato</w:t>
+      </w:r>
+      <w:proofErr w:type="gramEnd"/>
+    </w:p>
+    <w:p>
+      <w:pPr>
+        <w:pStyle w:val="Prrafodelista"/>
+        <w:numPr>
+          <w:ilvl w:val="0"/>
+          <w:numId w:val="2"/>
+        </w:numPr>
+      </w:pPr>
+      <w:r>
+        <w:t>Utiliza el siguiente organizador gráfico para clasificar las características de JSON y XML basándote en la comparativa anterior y el contenido del Tema 4.</w:t>
+      </w:r>
+    </w:p>
+    <w:p>
+      <w:pPr>
+        <w:pStyle w:val="Prrafodelista"/>
+      </w:pPr>
+      <w:r>
+        <w:drawing>
+          <wp:inline distT="0" distB="0" distL="0" distR="0" wp14:anchorId="69597088" wp14:editId="687E3C2B">
+            <wp:extent cx="2530059" cy="1653683"/>
+            <wp:effectExtent l="0" t="0" r="3810" b="3810"/>
+            <wp:docPr id="1" name="Imagen 1"/>
+            <wp:cNvGraphicFramePr>
+              <a:graphicFrameLocks xmlns:a="http://schemas.openxmlformats.org/drawingml/2006/main" noChangeAspect="1"/>
+            </wp:cNvGraphicFramePr>
+            <a:graphic xmlns:a="http://schemas.openxmlformats.org/drawingml/2006/main">
+              <a:graphicData uri="http://schemas.openxmlformats.org/drawingml/2006/picture">
+                <pic:pic xmlns:pic="http://schemas.openxmlformats.org/drawingml/2006/picture">
+                  <pic:nvPicPr>
+                    <pic:cNvPr id="1" name=""/>
+                    <pic:cNvPicPr/>
+                  </pic:nvPicPr>
+                  <pic:blipFill>
+                    <a:blip r:embed="rId5"/>
+                    <a:stretch>
+                      <a:fillRect/>
+                    </a:stretch>
+                  </pic:blipFill>
+                  <pic:spPr>
+                    <a:xfrm>
+                      <a:off x="0" y="0"/>
+                      <a:ext cx="2530059" cy="1653683"/>
+                    </a:xfrm>
+                    <a:prstGeom prst="rect">
+                      <a:avLst/>
+                    </a:prstGeom>
+                  </pic:spPr>
+                </pic:pic>
+              </a:graphicData>
+            </a:graphic>
+          </wp:inline>
+        </w:drawing>
+      </w:r>
+    </w:p>
+    <w:p>
+      <w:pPr>
+        <w:pStyle w:val="Prrafodelista"/>
+      </w:pPr>
+      <w:proofErr w:type="spellStart"/>
+      <w:r>
+        <w:t>Json</w:t>
+      </w:r>
+      <w:proofErr w:type="spellEnd"/>
+      <w:r>
+        <w:t xml:space="preserve"> </w:t>
+      </w:r>
+    </w:p>
+    <w:p>
+      <w:pPr>
+        <w:pStyle w:val="Prrafodelista"/>
+        <w:numPr>
+          <w:ilvl w:val="0"/>
+          <w:numId w:val="3"/>
+        </w:numPr>
+      </w:pPr>
+      <w:r>
+        <w:t>Utiliza un formato de clave valor</w:t>
+      </w:r>
+    </w:p>
+    <w:p>
+      <w:pPr>
+        <w:pStyle w:val="Prrafodelista"/>
+        <w:numPr>
+          <w:ilvl w:val="0"/>
+          <w:numId w:val="3"/>
+        </w:numPr>
+      </w:pPr>
+      <w:r>
+        <w:t>Utiliza corchetes para englobar los datos</w:t>
+      </w:r>
+    </w:p>
+    <w:p>
+      <w:proofErr w:type="spellStart"/>
+      <w:r>
+        <w:t>Xml</w:t>
+      </w:r>
+      <w:proofErr w:type="spellEnd"/>
+    </w:p>
+    <w:p>
+      <w:pPr>
+        <w:pStyle w:val="Prrafodelista"/>
+        <w:numPr>
+          <w:ilvl w:val="0"/>
+          <w:numId w:val="4"/>
+        </w:numPr>
+      </w:pPr>
+      <w:r>
+        <w:t xml:space="preserve">Utiliza un formato parecido a </w:t>
+      </w:r>
+      <w:proofErr w:type="spellStart"/>
+      <w:r>
+        <w:t>html</w:t>
+      </w:r>
+      <w:proofErr w:type="spellEnd"/>
+    </w:p>
+    <w:p>
+      <w:pPr>
+        <w:pStyle w:val="Prrafodelista"/>
+        <w:numPr>
+          <w:ilvl w:val="0"/>
+          <w:numId w:val="4"/>
+        </w:numPr>
+      </w:pPr>
+      <w:r>
+        <w:t>Utiliza “</w:t>
+      </w:r>
+      <w:r>
+        <w:t>&lt;/</w:t>
+      </w:r>
+      <w:proofErr w:type="spellStart"/>
+      <w:r>
+        <w:t>device</w:t>
+      </w:r>
+      <w:proofErr w:type="spellEnd"/>
+      <w:r>
+        <w:t>&gt;</w:t>
+      </w:r>
+      <w:r>
+        <w:t>” para englobar los datos</w:t>
+      </w:r>
+    </w:p>
+    <w:p>
+      <w:pPr>
+        <w:pStyle w:val="Prrafodelista"/>
+      </w:pPr>
+    </w:p>
     <w:sectPr>
       <w:pgSz w:w="12240" w:h="15840"/>
       <w:pgMar w:top="1417" w:right="1701" w:bottom="1417" w:left="1701" w:header="708" w:footer="708" w:gutter="0"/>
@@ -11,6 +970,427 @@
     </w:sectPr>
   </w:body>
 </w:document>
+</file>
+
+<file path=word/numbering.xml><?xml version="1.0" encoding="utf-8"?>
+<w:numbering xmlns:wpc="http://schemas.microsoft.com/office/word/2010/wordprocessingCanvas" xmlns:cx="http://schemas.microsoft.com/office/drawing/2014/chartex" xmlns:cx1="http://schemas.microsoft.com/office/drawing/2015/9/8/chartex" xmlns:cx2="http://schemas.microsoft.com/office/drawing/2015/10/21/chartex" xmlns:cx3="http://schemas.microsoft.com/office/drawing/2016/5/9/chartex" xmlns:cx4="http://schemas.microsoft.com/office/drawing/2016/5/10/chartex" xmlns:cx5="http://schemas.microsoft.com/office/drawing/2016/5/11/chartex" xmlns:cx6="http://schemas.microsoft.com/office/drawing/2016/5/12/chartex" xmlns:cx7="http://schemas.microsoft.com/office/drawing/2016/5/13/chartex" xmlns:cx8="http://schemas.microsoft.com/office/drawing/2016/5/14/chartex" xmlns:mc="http://schemas.openxmlformats.org/markup-compatibility/2006" xmlns:aink="http://schemas.microsoft.com/office/drawing/2016/ink" xmlns:am3d="http://schemas.microsoft.com/office/drawing/2017/model3d" xmlns:o="urn:schemas-microsoft-com:office:office" xmlns:oel="http://schemas.microsoft.com/office/2019/extlst" xmlns:r="http://schemas.openxmlformats.org/officeDocument/2006/relationships" xmlns:m="http://schemas.openxmlformats.org/officeDocument/2006/math" xmlns:v="urn:schemas-microsoft-com:vml" xmlns:wp14="http://schemas.microsoft.com/office/word/2010/wordprocessingDrawing" xmlns:wp="http://schemas.openxmlformats.org/drawingml/2006/wordprocessingDrawing" xmlns:w10="urn:schemas-microsoft-com:office:word" xmlns:w="http://schemas.openxmlformats.org/wordprocessingml/2006/main" xmlns:w14="http://schemas.microsoft.com/office/word/2010/wordml" xmlns:w15="http://schemas.microsoft.com/office/word/2012/wordml" xmlns:w16cex="http://schemas.microsoft.com/office/word/2018/wordml/cex" xmlns:w16cid="http://schemas.microsoft.com/office/word/2016/wordml/cid" xmlns:w16="http://schemas.microsoft.com/office/word/2018/wordml" xmlns:w16sdtdh="http://schemas.microsoft.com/office/word/2020/wordml/sdtdatahash" xmlns:w16se="http://schemas.microsoft.com/office/word/2015/wordml/symex" xmlns:wpg="http://schemas.microsoft.com/office/word/2010/wordprocessingGroup" xmlns:wpi="http://schemas.microsoft.com/office/word/2010/wordprocessingInk" xmlns:wne="http://schemas.microsoft.com/office/word/2006/wordml" xmlns:wps="http://schemas.microsoft.com/office/word/2010/wordprocessingShape" mc:Ignorable="w14 w15 w16se w16cid w16 w16cex w16sdtdh wp14">
+  <w:abstractNum w:abstractNumId="0" w15:restartNumberingAfterBreak="0">
+    <w:nsid w:val="09884F95"/>
+    <w:multiLevelType w:val="hybridMultilevel"/>
+    <w:tmpl w:val="BD4A3488"/>
+    <w:lvl w:ilvl="0" w:tplc="080A000F">
+      <w:start w:val="1"/>
+      <w:numFmt w:val="decimal"/>
+      <w:lvlText w:val="%1."/>
+      <w:lvlJc w:val="left"/>
+      <w:pPr>
+        <w:ind w:left="720" w:hanging="360"/>
+      </w:pPr>
+      <w:rPr>
+        <w:rFonts w:hint="default"/>
+      </w:rPr>
+    </w:lvl>
+    <w:lvl w:ilvl="1" w:tplc="080A0019" w:tentative="1">
+      <w:start w:val="1"/>
+      <w:numFmt w:val="lowerLetter"/>
+      <w:lvlText w:val="%2."/>
+      <w:lvlJc w:val="left"/>
+      <w:pPr>
+        <w:ind w:left="1440" w:hanging="360"/>
+      </w:pPr>
+    </w:lvl>
+    <w:lvl w:ilvl="2" w:tplc="080A001B" w:tentative="1">
+      <w:start w:val="1"/>
+      <w:numFmt w:val="lowerRoman"/>
+      <w:lvlText w:val="%3."/>
+      <w:lvlJc w:val="right"/>
+      <w:pPr>
+        <w:ind w:left="2160" w:hanging="180"/>
+      </w:pPr>
+    </w:lvl>
+    <w:lvl w:ilvl="3" w:tplc="080A000F" w:tentative="1">
+      <w:start w:val="1"/>
+      <w:numFmt w:val="decimal"/>
+      <w:lvlText w:val="%4."/>
+      <w:lvlJc w:val="left"/>
+      <w:pPr>
+        <w:ind w:left="2880" w:hanging="360"/>
+      </w:pPr>
+    </w:lvl>
+    <w:lvl w:ilvl="4" w:tplc="080A0019" w:tentative="1">
+      <w:start w:val="1"/>
+      <w:numFmt w:val="lowerLetter"/>
+      <w:lvlText w:val="%5."/>
+      <w:lvlJc w:val="left"/>
+      <w:pPr>
+        <w:ind w:left="3600" w:hanging="360"/>
+      </w:pPr>
+    </w:lvl>
+    <w:lvl w:ilvl="5" w:tplc="080A001B" w:tentative="1">
+      <w:start w:val="1"/>
+      <w:numFmt w:val="lowerRoman"/>
+      <w:lvlText w:val="%6."/>
+      <w:lvlJc w:val="right"/>
+      <w:pPr>
+        <w:ind w:left="4320" w:hanging="180"/>
+      </w:pPr>
+    </w:lvl>
+    <w:lvl w:ilvl="6" w:tplc="080A000F" w:tentative="1">
+      <w:start w:val="1"/>
+      <w:numFmt w:val="decimal"/>
+      <w:lvlText w:val="%7."/>
+      <w:lvlJc w:val="left"/>
+      <w:pPr>
+        <w:ind w:left="5040" w:hanging="360"/>
+      </w:pPr>
+    </w:lvl>
+    <w:lvl w:ilvl="7" w:tplc="080A0019" w:tentative="1">
+      <w:start w:val="1"/>
+      <w:numFmt w:val="lowerLetter"/>
+      <w:lvlText w:val="%8."/>
+      <w:lvlJc w:val="left"/>
+      <w:pPr>
+        <w:ind w:left="5760" w:hanging="360"/>
+      </w:pPr>
+    </w:lvl>
+    <w:lvl w:ilvl="8" w:tplc="080A001B" w:tentative="1">
+      <w:start w:val="1"/>
+      <w:numFmt w:val="lowerRoman"/>
+      <w:lvlText w:val="%9."/>
+      <w:lvlJc w:val="right"/>
+      <w:pPr>
+        <w:ind w:left="6480" w:hanging="180"/>
+      </w:pPr>
+    </w:lvl>
+  </w:abstractNum>
+  <w:abstractNum w:abstractNumId="1" w15:restartNumberingAfterBreak="0">
+    <w:nsid w:val="4C5222CD"/>
+    <w:multiLevelType w:val="hybridMultilevel"/>
+    <w:tmpl w:val="A1444228"/>
+    <w:lvl w:ilvl="0" w:tplc="080A0001">
+      <w:start w:val="1"/>
+      <w:numFmt w:val="bullet"/>
+      <w:lvlText w:val=""/>
+      <w:lvlJc w:val="left"/>
+      <w:pPr>
+        <w:ind w:left="1440" w:hanging="360"/>
+      </w:pPr>
+      <w:rPr>
+        <w:rFonts w:ascii="Symbol" w:hAnsi="Symbol" w:hint="default"/>
+      </w:rPr>
+    </w:lvl>
+    <w:lvl w:ilvl="1" w:tplc="080A0003" w:tentative="1">
+      <w:start w:val="1"/>
+      <w:numFmt w:val="bullet"/>
+      <w:lvlText w:val="o"/>
+      <w:lvlJc w:val="left"/>
+      <w:pPr>
+        <w:ind w:left="2160" w:hanging="360"/>
+      </w:pPr>
+      <w:rPr>
+        <w:rFonts w:ascii="Courier New" w:hAnsi="Courier New" w:cs="Courier New" w:hint="default"/>
+      </w:rPr>
+    </w:lvl>
+    <w:lvl w:ilvl="2" w:tplc="080A0005" w:tentative="1">
+      <w:start w:val="1"/>
+      <w:numFmt w:val="bullet"/>
+      <w:lvlText w:val=""/>
+      <w:lvlJc w:val="left"/>
+      <w:pPr>
+        <w:ind w:left="2880" w:hanging="360"/>
+      </w:pPr>
+      <w:rPr>
+        <w:rFonts w:ascii="Wingdings" w:hAnsi="Wingdings" w:hint="default"/>
+      </w:rPr>
+    </w:lvl>
+    <w:lvl w:ilvl="3" w:tplc="080A0001" w:tentative="1">
+      <w:start w:val="1"/>
+      <w:numFmt w:val="bullet"/>
+      <w:lvlText w:val=""/>
+      <w:lvlJc w:val="left"/>
+      <w:pPr>
+        <w:ind w:left="3600" w:hanging="360"/>
+      </w:pPr>
+      <w:rPr>
+        <w:rFonts w:ascii="Symbol" w:hAnsi="Symbol" w:hint="default"/>
+      </w:rPr>
+    </w:lvl>
+    <w:lvl w:ilvl="4" w:tplc="080A0003" w:tentative="1">
+      <w:start w:val="1"/>
+      <w:numFmt w:val="bullet"/>
+      <w:lvlText w:val="o"/>
+      <w:lvlJc w:val="left"/>
+      <w:pPr>
+        <w:ind w:left="4320" w:hanging="360"/>
+      </w:pPr>
+      <w:rPr>
+        <w:rFonts w:ascii="Courier New" w:hAnsi="Courier New" w:cs="Courier New" w:hint="default"/>
+      </w:rPr>
+    </w:lvl>
+    <w:lvl w:ilvl="5" w:tplc="080A0005" w:tentative="1">
+      <w:start w:val="1"/>
+      <w:numFmt w:val="bullet"/>
+      <w:lvlText w:val=""/>
+      <w:lvlJc w:val="left"/>
+      <w:pPr>
+        <w:ind w:left="5040" w:hanging="360"/>
+      </w:pPr>
+      <w:rPr>
+        <w:rFonts w:ascii="Wingdings" w:hAnsi="Wingdings" w:hint="default"/>
+      </w:rPr>
+    </w:lvl>
+    <w:lvl w:ilvl="6" w:tplc="080A0001" w:tentative="1">
+      <w:start w:val="1"/>
+      <w:numFmt w:val="bullet"/>
+      <w:lvlText w:val=""/>
+      <w:lvlJc w:val="left"/>
+      <w:pPr>
+        <w:ind w:left="5760" w:hanging="360"/>
+      </w:pPr>
+      <w:rPr>
+        <w:rFonts w:ascii="Symbol" w:hAnsi="Symbol" w:hint="default"/>
+      </w:rPr>
+    </w:lvl>
+    <w:lvl w:ilvl="7" w:tplc="080A0003" w:tentative="1">
+      <w:start w:val="1"/>
+      <w:numFmt w:val="bullet"/>
+      <w:lvlText w:val="o"/>
+      <w:lvlJc w:val="left"/>
+      <w:pPr>
+        <w:ind w:left="6480" w:hanging="360"/>
+      </w:pPr>
+      <w:rPr>
+        <w:rFonts w:ascii="Courier New" w:hAnsi="Courier New" w:cs="Courier New" w:hint="default"/>
+      </w:rPr>
+    </w:lvl>
+    <w:lvl w:ilvl="8" w:tplc="080A0005" w:tentative="1">
+      <w:start w:val="1"/>
+      <w:numFmt w:val="bullet"/>
+      <w:lvlText w:val=""/>
+      <w:lvlJc w:val="left"/>
+      <w:pPr>
+        <w:ind w:left="7200" w:hanging="360"/>
+      </w:pPr>
+      <w:rPr>
+        <w:rFonts w:ascii="Wingdings" w:hAnsi="Wingdings" w:hint="default"/>
+      </w:rPr>
+    </w:lvl>
+  </w:abstractNum>
+  <w:abstractNum w:abstractNumId="2" w15:restartNumberingAfterBreak="0">
+    <w:nsid w:val="5CA31AD1"/>
+    <w:multiLevelType w:val="hybridMultilevel"/>
+    <w:tmpl w:val="2BDE679A"/>
+    <w:lvl w:ilvl="0" w:tplc="080A000F">
+      <w:start w:val="1"/>
+      <w:numFmt w:val="decimal"/>
+      <w:lvlText w:val="%1."/>
+      <w:lvlJc w:val="left"/>
+      <w:pPr>
+        <w:ind w:left="720" w:hanging="360"/>
+      </w:pPr>
+      <w:rPr>
+        <w:rFonts w:hint="default"/>
+      </w:rPr>
+    </w:lvl>
+    <w:lvl w:ilvl="1" w:tplc="080A0019" w:tentative="1">
+      <w:start w:val="1"/>
+      <w:numFmt w:val="lowerLetter"/>
+      <w:lvlText w:val="%2."/>
+      <w:lvlJc w:val="left"/>
+      <w:pPr>
+        <w:ind w:left="1440" w:hanging="360"/>
+      </w:pPr>
+    </w:lvl>
+    <w:lvl w:ilvl="2" w:tplc="080A001B" w:tentative="1">
+      <w:start w:val="1"/>
+      <w:numFmt w:val="lowerRoman"/>
+      <w:lvlText w:val="%3."/>
+      <w:lvlJc w:val="right"/>
+      <w:pPr>
+        <w:ind w:left="2160" w:hanging="180"/>
+      </w:pPr>
+    </w:lvl>
+    <w:lvl w:ilvl="3" w:tplc="080A000F" w:tentative="1">
+      <w:start w:val="1"/>
+      <w:numFmt w:val="decimal"/>
+      <w:lvlText w:val="%4."/>
+      <w:lvlJc w:val="left"/>
+      <w:pPr>
+        <w:ind w:left="2880" w:hanging="360"/>
+      </w:pPr>
+    </w:lvl>
+    <w:lvl w:ilvl="4" w:tplc="080A0019" w:tentative="1">
+      <w:start w:val="1"/>
+      <w:numFmt w:val="lowerLetter"/>
+      <w:lvlText w:val="%5."/>
+      <w:lvlJc w:val="left"/>
+      <w:pPr>
+        <w:ind w:left="3600" w:hanging="360"/>
+      </w:pPr>
+    </w:lvl>
+    <w:lvl w:ilvl="5" w:tplc="080A001B" w:tentative="1">
+      <w:start w:val="1"/>
+      <w:numFmt w:val="lowerRoman"/>
+      <w:lvlText w:val="%6."/>
+      <w:lvlJc w:val="right"/>
+      <w:pPr>
+        <w:ind w:left="4320" w:hanging="180"/>
+      </w:pPr>
+    </w:lvl>
+    <w:lvl w:ilvl="6" w:tplc="080A000F" w:tentative="1">
+      <w:start w:val="1"/>
+      <w:numFmt w:val="decimal"/>
+      <w:lvlText w:val="%7."/>
+      <w:lvlJc w:val="left"/>
+      <w:pPr>
+        <w:ind w:left="5040" w:hanging="360"/>
+      </w:pPr>
+    </w:lvl>
+    <w:lvl w:ilvl="7" w:tplc="080A0019" w:tentative="1">
+      <w:start w:val="1"/>
+      <w:numFmt w:val="lowerLetter"/>
+      <w:lvlText w:val="%8."/>
+      <w:lvlJc w:val="left"/>
+      <w:pPr>
+        <w:ind w:left="5760" w:hanging="360"/>
+      </w:pPr>
+    </w:lvl>
+    <w:lvl w:ilvl="8" w:tplc="080A001B" w:tentative="1">
+      <w:start w:val="1"/>
+      <w:numFmt w:val="lowerRoman"/>
+      <w:lvlText w:val="%9."/>
+      <w:lvlJc w:val="right"/>
+      <w:pPr>
+        <w:ind w:left="6480" w:hanging="180"/>
+      </w:pPr>
+    </w:lvl>
+  </w:abstractNum>
+  <w:abstractNum w:abstractNumId="3" w15:restartNumberingAfterBreak="0">
+    <w:nsid w:val="60927C3F"/>
+    <w:multiLevelType w:val="hybridMultilevel"/>
+    <w:tmpl w:val="9E489EB2"/>
+    <w:lvl w:ilvl="0" w:tplc="080A0001">
+      <w:start w:val="1"/>
+      <w:numFmt w:val="bullet"/>
+      <w:lvlText w:val=""/>
+      <w:lvlJc w:val="left"/>
+      <w:pPr>
+        <w:ind w:left="720" w:hanging="360"/>
+      </w:pPr>
+      <w:rPr>
+        <w:rFonts w:ascii="Symbol" w:hAnsi="Symbol" w:hint="default"/>
+      </w:rPr>
+    </w:lvl>
+    <w:lvl w:ilvl="1" w:tplc="080A0003" w:tentative="1">
+      <w:start w:val="1"/>
+      <w:numFmt w:val="bullet"/>
+      <w:lvlText w:val="o"/>
+      <w:lvlJc w:val="left"/>
+      <w:pPr>
+        <w:ind w:left="1440" w:hanging="360"/>
+      </w:pPr>
+      <w:rPr>
+        <w:rFonts w:ascii="Courier New" w:hAnsi="Courier New" w:cs="Courier New" w:hint="default"/>
+      </w:rPr>
+    </w:lvl>
+    <w:lvl w:ilvl="2" w:tplc="080A0005" w:tentative="1">
+      <w:start w:val="1"/>
+      <w:numFmt w:val="bullet"/>
+      <w:lvlText w:val=""/>
+      <w:lvlJc w:val="left"/>
+      <w:pPr>
+        <w:ind w:left="2160" w:hanging="360"/>
+      </w:pPr>
+      <w:rPr>
+        <w:rFonts w:ascii="Wingdings" w:hAnsi="Wingdings" w:hint="default"/>
+      </w:rPr>
+    </w:lvl>
+    <w:lvl w:ilvl="3" w:tplc="080A0001" w:tentative="1">
+      <w:start w:val="1"/>
+      <w:numFmt w:val="bullet"/>
+      <w:lvlText w:val=""/>
+      <w:lvlJc w:val="left"/>
+      <w:pPr>
+        <w:ind w:left="2880" w:hanging="360"/>
+      </w:pPr>
+      <w:rPr>
+        <w:rFonts w:ascii="Symbol" w:hAnsi="Symbol" w:hint="default"/>
+      </w:rPr>
+    </w:lvl>
+    <w:lvl w:ilvl="4" w:tplc="080A0003" w:tentative="1">
+      <w:start w:val="1"/>
+      <w:numFmt w:val="bullet"/>
+      <w:lvlText w:val="o"/>
+      <w:lvlJc w:val="left"/>
+      <w:pPr>
+        <w:ind w:left="3600" w:hanging="360"/>
+      </w:pPr>
+      <w:rPr>
+        <w:rFonts w:ascii="Courier New" w:hAnsi="Courier New" w:cs="Courier New" w:hint="default"/>
+      </w:rPr>
+    </w:lvl>
+    <w:lvl w:ilvl="5" w:tplc="080A0005" w:tentative="1">
+      <w:start w:val="1"/>
+      <w:numFmt w:val="bullet"/>
+      <w:lvlText w:val=""/>
+      <w:lvlJc w:val="left"/>
+      <w:pPr>
+        <w:ind w:left="4320" w:hanging="360"/>
+      </w:pPr>
+      <w:rPr>
+        <w:rFonts w:ascii="Wingdings" w:hAnsi="Wingdings" w:hint="default"/>
+      </w:rPr>
+    </w:lvl>
+    <w:lvl w:ilvl="6" w:tplc="080A0001" w:tentative="1">
+      <w:start w:val="1"/>
+      <w:numFmt w:val="bullet"/>
+      <w:lvlText w:val=""/>
+      <w:lvlJc w:val="left"/>
+      <w:pPr>
+        <w:ind w:left="5040" w:hanging="360"/>
+      </w:pPr>
+      <w:rPr>
+        <w:rFonts w:ascii="Symbol" w:hAnsi="Symbol" w:hint="default"/>
+      </w:rPr>
+    </w:lvl>
+    <w:lvl w:ilvl="7" w:tplc="080A0003" w:tentative="1">
+      <w:start w:val="1"/>
+      <w:numFmt w:val="bullet"/>
+      <w:lvlText w:val="o"/>
+      <w:lvlJc w:val="left"/>
+      <w:pPr>
+        <w:ind w:left="5760" w:hanging="360"/>
+      </w:pPr>
+      <w:rPr>
+        <w:rFonts w:ascii="Courier New" w:hAnsi="Courier New" w:cs="Courier New" w:hint="default"/>
+      </w:rPr>
+    </w:lvl>
+    <w:lvl w:ilvl="8" w:tplc="080A0005" w:tentative="1">
+      <w:start w:val="1"/>
+      <w:numFmt w:val="bullet"/>
+      <w:lvlText w:val=""/>
+      <w:lvlJc w:val="left"/>
+      <w:pPr>
+        <w:ind w:left="6480" w:hanging="360"/>
+      </w:pPr>
+      <w:rPr>
+        <w:rFonts w:ascii="Wingdings" w:hAnsi="Wingdings" w:hint="default"/>
+      </w:rPr>
+    </w:lvl>
+  </w:abstractNum>
+  <w:num w:numId="1" w16cid:durableId="1878152133">
+    <w:abstractNumId w:val="2"/>
+  </w:num>
+  <w:num w:numId="2" w16cid:durableId="1441223510">
+    <w:abstractNumId w:val="0"/>
+  </w:num>
+  <w:num w:numId="3" w16cid:durableId="2011330239">
+    <w:abstractNumId w:val="1"/>
+  </w:num>
+  <w:num w:numId="4" w16cid:durableId="1400667026">
+    <w:abstractNumId w:val="3"/>
+  </w:num>
+</w:numbering>
 </file>
 
 <file path=word/styles.xml><?xml version="1.0" encoding="utf-8"?>
@@ -439,6 +1819,17 @@
     <w:semiHidden/>
     <w:unhideWhenUsed/>
   </w:style>
+  <w:style w:type="paragraph" w:styleId="Prrafodelista">
+    <w:name w:val="List Paragraph"/>
+    <w:basedOn w:val="Normal"/>
+    <w:uiPriority w:val="34"/>
+    <w:qFormat/>
+    <w:rsid w:val="004A6D0F"/>
+    <w:pPr>
+      <w:ind w:left="720"/>
+      <w:contextualSpacing/>
+    </w:pPr>
+  </w:style>
 </w:styles>
 </file>
 

</xml_diff>